<commit_message>
feat(md-build): default Chinese layout upgrade (three-line tables, paragraph/caption details)
- body: 0 before/after + first-line indent 2 CJK chars
- captions: single line-spacing, no indent, centered
- default three-line tables (top/bottom 1.5pt, header 0.75pt, no verticals) + AutoFit
- make_reference_cn.py: set Normal/BodyText/FirstParagraph spacing & indent,
  caption single spacing, three-line table borders; extend deterministic self-check
- regenerate reference-cn.docx (2026-08-10)
- CHANGELOG: add Unreleased entry
</commit_message>
<xml_diff>
--- a/md-build/reference-cn.docx
+++ b/md-build/reference-cn.docx
@@ -507,7 +507,8 @@
       <w:szCs w:val="24"/>
     </w:rPr>
     <w:pPr>
-      <w:spacing w:line="360" w:lineRule="auto"/>
+      <w:spacing w:line="360" w:lineRule="auto" w:before="0" w:after="0"/>
+      <w:ind w:firstLineChars="200" w:firstLine="480"/>
     </w:pPr>
   </w:style>
   <w:style w:type="paragraph" w:styleId="BodyText">
@@ -516,7 +517,8 @@
     <w:link w:val="BodyTextChar"/>
     <w:qFormat/>
     <w:pPr>
-      <w:spacing w:before="180" w:after="180" w:line="360" w:lineRule="auto"/>
+      <w:spacing w:before="0" w:after="0" w:line="360" w:lineRule="auto"/>
+      <w:ind w:firstLineChars="200" w:firstLine="480"/>
     </w:pPr>
     <w:rPr>
       <w:rFonts w:ascii="Times New Roman" w:hAnsi="Times New Roman" w:eastAsia="宋体" w:cs="Times New Roman"/>
@@ -535,7 +537,8 @@
       <w:szCs w:val="24"/>
     </w:rPr>
     <w:pPr>
-      <w:spacing w:line="360" w:lineRule="auto"/>
+      <w:spacing w:line="360" w:lineRule="auto" w:before="0" w:after="0"/>
+      <w:ind w:firstLineChars="200" w:firstLine="480"/>
     </w:pPr>
   </w:style>
   <w:style w:type="paragraph" w:customStyle="1" w:styleId="Compact">
@@ -543,8 +546,14 @@
     <w:basedOn w:val="BodyText"/>
     <w:qFormat/>
     <w:pPr>
-      <w:spacing w:before="36" w:after="36"/>
-    </w:pPr>
+      <w:spacing w:before="0" w:after="0" w:line="360" w:lineRule="auto"/>
+      <w:ind w:firstLineChars="0" w:firstLine="0"/>
+    </w:pPr>
+    <w:rPr>
+      <w:rFonts w:ascii="Times New Roman" w:hAnsi="Times New Roman" w:eastAsia="宋体" w:cs="Times New Roman"/>
+      <w:sz w:val="24"/>
+      <w:szCs w:val="24"/>
+    </w:rPr>
   </w:style>
   <w:style w:type="paragraph" w:styleId="Title">
     <w:name w:val="Title"/>
@@ -690,8 +699,9 @@
     <w:pPr>
       <w:keepNext/>
       <w:keepLines/>
-      <w:spacing w:before="360" w:after="80" w:line="360" w:lineRule="auto"/>
+      <w:spacing w:before="0" w:after="0" w:line="360" w:lineRule="auto"/>
       <w:outlineLvl w:val="0"/>
+      <w:ind w:firstLineChars="0" w:firstLine="0"/>
     </w:pPr>
     <w:rPr>
       <w:rFonts w:asciiTheme="majorHAnsi" w:eastAsiaTheme="majorEastAsia" w:hAnsiTheme="majorHAnsi" w:cstheme="majorBidi" w:ascii="Times New Roman" w:hAnsi="Times New Roman" w:eastAsia="黑体" w:cs="Times New Roman"/>
@@ -715,8 +725,9 @@
     <w:pPr>
       <w:keepNext/>
       <w:keepLines/>
-      <w:spacing w:before="160" w:after="80" w:line="360" w:lineRule="auto"/>
+      <w:spacing w:before="0" w:after="0" w:line="360" w:lineRule="auto"/>
       <w:outlineLvl w:val="1"/>
+      <w:ind w:firstLineChars="0" w:firstLine="0"/>
     </w:pPr>
     <w:rPr>
       <w:rFonts w:asciiTheme="majorHAnsi" w:eastAsiaTheme="majorEastAsia" w:hAnsiTheme="majorHAnsi" w:cstheme="majorBidi" w:ascii="Times New Roman" w:hAnsi="Times New Roman" w:eastAsia="黑体" w:cs="Times New Roman"/>
@@ -740,8 +751,9 @@
     <w:pPr>
       <w:keepNext/>
       <w:keepLines/>
-      <w:spacing w:before="160" w:after="80" w:line="360" w:lineRule="auto"/>
+      <w:spacing w:before="0" w:after="0" w:line="360" w:lineRule="auto"/>
       <w:outlineLvl w:val="2"/>
+      <w:ind w:firstLineChars="0" w:firstLine="0"/>
     </w:pPr>
     <w:rPr>
       <w:rFonts w:eastAsiaTheme="majorEastAsia" w:cstheme="majorBidi" w:ascii="Times New Roman" w:hAnsi="Times New Roman" w:eastAsia="黑体" w:cs="Times New Roman"/>
@@ -1048,6 +1060,15 @@
     <w:qFormat/>
     <w:tblPr>
       <w:tblInd w:w="0" w:type="dxa"/>
+      <w:tblBorders>
+        <w:top w:val="single" w:sz="12" w:space="0" w:color="000000"/>
+        <w:left w:val="nil" w:sz="0" w:space="0" w:color="auto"/>
+        <w:bottom w:val="single" w:sz="12" w:space="0" w:color="000000"/>
+        <w:right w:val="nil" w:sz="0" w:space="0" w:color="auto"/>
+        <w:insideH w:val="nil" w:sz="0" w:space="0" w:color="auto"/>
+        <w:insideV w:val="nil" w:sz="0" w:space="0" w:color="auto"/>
+      </w:tblBorders>
+      <w:tblLayout w:type="autofit"/>
       <w:tblCellMar>
         <w:top w:w="0" w:type="dxa"/>
         <w:left w:w="108" w:type="dxa"/>
@@ -1058,7 +1079,7 @@
     <w:tblStylePr w:type="firstRow">
       <w:tcPr>
         <w:tcBorders>
-          <w:bottom w:val="single"/>
+          <w:bottom w:val="single" w:sz="6" w:space="0" w:color="000000"/>
         </w:tcBorders>
         <w:vAlign w:val="bottom"/>
       </w:tcPr>
@@ -1086,7 +1107,8 @@
     <w:basedOn w:val="Normal"/>
     <w:link w:val="BodyTextChar"/>
     <w:pPr>
-      <w:spacing w:before="0" w:after="120" w:line="360" w:lineRule="auto"/>
+      <w:spacing w:before="0" w:after="0" w:line="240" w:lineRule="auto"/>
+      <w:ind w:firstLineChars="0" w:firstLine="0"/>
       <w:jc w:val="center"/>
     </w:pPr>
     <w:rPr>
@@ -1101,7 +1123,8 @@
     <w:basedOn w:val="Caption"/>
     <w:pPr>
       <w:keepNext/>
-      <w:spacing w:line="360" w:lineRule="auto"/>
+      <w:spacing w:line="240" w:lineRule="auto" w:before="0" w:after="0"/>
+      <w:ind w:firstLineChars="0" w:firstLine="0"/>
       <w:jc w:val="center"/>
     </w:pPr>
     <w:rPr>
@@ -1119,7 +1142,8 @@
       <w:szCs w:val="24"/>
     </w:rPr>
     <w:pPr>
-      <w:spacing w:line="360" w:lineRule="auto"/>
+      <w:spacing w:line="240" w:lineRule="auto" w:before="0" w:after="0"/>
+      <w:ind w:firstLineChars="0" w:firstLine="0"/>
       <w:jc w:val="center"/>
     </w:pPr>
   </w:style>

</xml_diff>

<commit_message>
feat(md-build): post-build layout pass, auto crossref prefix, black headings
- postprocess_layout.py: real blank lines before/after figure and table blocks
  (blank -> caption -> object -> note -> blank); de-indent recognized notes
  (Note:/Source:/Data source:/Figure note:/Table note: and 注:/资料来源:/
  数据来源:/图注:/表注:, case-insensitive; 'Note that' not misdetected)
- dedup_crossref_prefix.lua + build.ps1 language detect: render references as
  Figure 1/Table 1 (en) or 图 1/表 1 (zh); strip hand-typed duplicate prefixes
  (Figure [@fig:1] -> Figure 1) fixing 'Figure fig. 1'; manuscript.md untouched
- make_reference_cn.py: all headings Heading1-9 black; self-check extended
- build.ps1: wire lua filter before crossref + per-language metadata file +
  layout postprocess before existing XML/conservation gates
- CHANGELOG: add Unreleased entries
</commit_message>
<xml_diff>
--- a/md-build/reference-cn.docx
+++ b/md-build/reference-cn.docx
@@ -705,7 +705,7 @@
     </w:pPr>
     <w:rPr>
       <w:rFonts w:asciiTheme="majorHAnsi" w:eastAsiaTheme="majorEastAsia" w:hAnsiTheme="majorHAnsi" w:cstheme="majorBidi" w:ascii="Times New Roman" w:hAnsi="Times New Roman" w:eastAsia="黑体" w:cs="Times New Roman"/>
-      <w:color w:val="0F4761" w:themeColor="accent1" w:themeShade="BF"/>
+      <w:color w:val="000000"/>
       <w:sz w:val="32"/>
       <w:szCs w:val="32"/>
       <w:b/>
@@ -731,7 +731,7 @@
     </w:pPr>
     <w:rPr>
       <w:rFonts w:asciiTheme="majorHAnsi" w:eastAsiaTheme="majorEastAsia" w:hAnsiTheme="majorHAnsi" w:cstheme="majorBidi" w:ascii="Times New Roman" w:hAnsi="Times New Roman" w:eastAsia="黑体" w:cs="Times New Roman"/>
-      <w:color w:val="0F4761" w:themeColor="accent1" w:themeShade="BF"/>
+      <w:color w:val="000000"/>
       <w:sz w:val="32"/>
       <w:szCs w:val="32"/>
       <w:b/>
@@ -757,7 +757,7 @@
     </w:pPr>
     <w:rPr>
       <w:rFonts w:eastAsiaTheme="majorEastAsia" w:cstheme="majorBidi" w:ascii="Times New Roman" w:hAnsi="Times New Roman" w:eastAsia="黑体" w:cs="Times New Roman"/>
-      <w:color w:val="0F4761" w:themeColor="accent1" w:themeShade="BF"/>
+      <w:color w:val="000000"/>
       <w:sz w:val="28"/>
       <w:szCs w:val="28"/>
       <w:b w:val="0"/>
@@ -784,7 +784,7 @@
       <w:rFonts w:eastAsiaTheme="majorEastAsia" w:cstheme="majorBidi"/>
       <w:i/>
       <w:iCs/>
-      <w:color w:val="0F4761" w:themeColor="accent1" w:themeShade="BF"/>
+      <w:color w:val="000000"/>
     </w:rPr>
   </w:style>
   <w:style w:type="paragraph" w:styleId="Heading5">
@@ -805,7 +805,7 @@
     </w:pPr>
     <w:rPr>
       <w:rFonts w:eastAsiaTheme="majorEastAsia" w:cstheme="majorBidi"/>
-      <w:color w:val="0F4761" w:themeColor="accent1" w:themeShade="BF"/>
+      <w:color w:val="000000"/>
     </w:rPr>
   </w:style>
   <w:style w:type="paragraph" w:styleId="Heading6">
@@ -828,7 +828,7 @@
       <w:rFonts w:eastAsiaTheme="majorEastAsia" w:cstheme="majorBidi"/>
       <w:i/>
       <w:iCs/>
-      <w:color w:val="595959" w:themeColor="text1" w:themeTint="A6"/>
+      <w:color w:val="000000"/>
     </w:rPr>
   </w:style>
   <w:style w:type="paragraph" w:styleId="Heading7">
@@ -849,7 +849,7 @@
     </w:pPr>
     <w:rPr>
       <w:rFonts w:eastAsiaTheme="majorEastAsia" w:cstheme="majorBidi"/>
-      <w:color w:val="595959" w:themeColor="text1" w:themeTint="A6"/>
+      <w:color w:val="000000"/>
     </w:rPr>
   </w:style>
   <w:style w:type="paragraph" w:styleId="Heading8">
@@ -872,7 +872,7 @@
       <w:rFonts w:eastAsiaTheme="majorEastAsia" w:cstheme="majorBidi"/>
       <w:i/>
       <w:iCs/>
-      <w:color w:val="272727" w:themeColor="text1" w:themeTint="D8"/>
+      <w:color w:val="000000"/>
     </w:rPr>
   </w:style>
   <w:style w:type="paragraph" w:styleId="Heading9">
@@ -893,7 +893,7 @@
     </w:pPr>
     <w:rPr>
       <w:rFonts w:eastAsiaTheme="majorEastAsia" w:cstheme="majorBidi"/>
-      <w:color w:val="272727" w:themeColor="text1" w:themeTint="D8"/>
+      <w:color w:val="000000"/>
     </w:rPr>
   </w:style>
   <w:style w:type="character" w:customStyle="1" w:styleId="Heading1Char">

</xml_diff>